<commit_message>
create 02.EF intro ex
</commit_message>
<xml_diff>
--- a/06.CSharp-EntityFramework/02.Entity-Framework-Introduction/02.Entity-Framework-Introduction-Exercises.docx
+++ b/06.CSharp-EntityFramework/02.Entity-Framework-Introduction/02.Entity-Framework-Introduction-Exercises.docx
@@ -1,6 +1,6 @@
 
 <file path=word/document.xml><?xml version="1.0" encoding="utf-8"?>
-<w:document xmlns:wpc="http://schemas.microsoft.com/office/word/2010/wordprocessingCanvas" xmlns:cx="http://schemas.microsoft.com/office/drawing/2014/chartex" xmlns:cx1="http://schemas.microsoft.com/office/drawing/2015/9/8/chartex" xmlns:cx2="http://schemas.microsoft.com/office/drawing/2015/10/21/chartex" xmlns:cx3="http://schemas.microsoft.com/office/drawing/2016/5/9/chartex" xmlns:cx4="http://schemas.microsoft.com/office/drawing/2016/5/10/chartex" xmlns:cx5="http://schemas.microsoft.com/office/drawing/2016/5/11/chartex" xmlns:cx6="http://schemas.microsoft.com/office/drawing/2016/5/12/chartex" xmlns:cx7="http://schemas.microsoft.com/office/drawing/2016/5/13/chartex" xmlns:cx8="http://schemas.microsoft.com/office/drawing/2016/5/14/chartex" xmlns:mc="http://schemas.openxmlformats.org/markup-compatibility/2006" xmlns:aink="http://schemas.microsoft.com/office/drawing/2016/ink" xmlns:am3d="http://schemas.microsoft.com/office/drawing/2017/model3d" xmlns:o="urn:schemas-microsoft-com:office:office" xmlns:oel="http://schemas.microsoft.com/office/2019/extlst" xmlns:r="http://schemas.openxmlformats.org/officeDocument/2006/relationships" xmlns:m="http://schemas.openxmlformats.org/officeDocument/2006/math" xmlns:v="urn:schemas-microsoft-com:vml" xmlns:wp14="http://schemas.microsoft.com/office/word/2010/wordprocessingDrawing" xmlns:wp="http://schemas.openxmlformats.org/drawingml/2006/wordprocessingDrawing" xmlns:w10="urn:schemas-microsoft-com:office:word" xmlns:w="http://schemas.openxmlformats.org/wordprocessingml/2006/main" xmlns:w14="http://schemas.microsoft.com/office/word/2010/wordml" xmlns:w15="http://schemas.microsoft.com/office/word/2012/wordml" xmlns:w16cex="http://schemas.microsoft.com/office/word/2018/wordml/cex" xmlns:w16cid="http://schemas.microsoft.com/office/word/2016/wordml/cid" xmlns:w16="http://schemas.microsoft.com/office/word/2018/wordml" xmlns:w16du="http://schemas.microsoft.com/office/word/2023/wordml/word16du" xmlns:w16sdtdh="http://schemas.microsoft.com/office/word/2020/wordml/sdtdatahash" xmlns:w16sdtfl="http://schemas.microsoft.com/office/word/2024/wordml/sdtformatlock" xmlns:w16se="http://schemas.microsoft.com/office/word/2015/wordml/symex" xmlns:wpg="http://schemas.microsoft.com/office/word/2010/wordprocessingGroup" xmlns:wpi="http://schemas.microsoft.com/office/word/2010/wordprocessingInk" xmlns:wne="http://schemas.microsoft.com/office/word/2006/wordml" xmlns:wps="http://schemas.microsoft.com/office/word/2010/wordprocessingShape" mc:Ignorable="w14 w15 w16se w16cid w16 w16cex w16sdtdh w16sdtfl w16du wp14">
+<w:document xmlns:wpc="http://schemas.microsoft.com/office/word/2010/wordprocessingCanvas" xmlns:cx="http://schemas.microsoft.com/office/drawing/2014/chartex" xmlns:cx1="http://schemas.microsoft.com/office/drawing/2015/9/8/chartex" xmlns:cx2="http://schemas.microsoft.com/office/drawing/2015/10/21/chartex" xmlns:cx3="http://schemas.microsoft.com/office/drawing/2016/5/9/chartex" xmlns:cx4="http://schemas.microsoft.com/office/drawing/2016/5/10/chartex" xmlns:cx5="http://schemas.microsoft.com/office/drawing/2016/5/11/chartex" xmlns:cx6="http://schemas.microsoft.com/office/drawing/2016/5/12/chartex" xmlns:cx7="http://schemas.microsoft.com/office/drawing/2016/5/13/chartex" xmlns:cx8="http://schemas.microsoft.com/office/drawing/2016/5/14/chartex" xmlns:mc="http://schemas.openxmlformats.org/markup-compatibility/2006" xmlns:aink="http://schemas.microsoft.com/office/drawing/2016/ink" xmlns:am3d="http://schemas.microsoft.com/office/drawing/2017/model3d" xmlns:o="urn:schemas-microsoft-com:office:office" xmlns:oel="http://schemas.microsoft.com/office/2019/extlst" xmlns:r="http://schemas.openxmlformats.org/officeDocument/2006/relationships" xmlns:m="http://schemas.openxmlformats.org/officeDocument/2006/math" xmlns:v="urn:schemas-microsoft-com:vml" xmlns:wp14="http://schemas.microsoft.com/office/word/2010/wordprocessingDrawing" xmlns:wp="http://schemas.openxmlformats.org/drawingml/2006/wordprocessingDrawing" xmlns:w10="urn:schemas-microsoft-com:office:word" xmlns:w="http://schemas.openxmlformats.org/wordprocessingml/2006/main" xmlns:w14="http://schemas.microsoft.com/office/word/2010/wordml" xmlns:w15="http://schemas.microsoft.com/office/word/2012/wordml" xmlns:w16cex="http://schemas.microsoft.com/office/word/2018/wordml/cex" xmlns:w16cid="http://schemas.microsoft.com/office/word/2016/wordml/cid" xmlns:w16="http://schemas.microsoft.com/office/word/2018/wordml" xmlns:w16sdtdh="http://schemas.microsoft.com/office/word/2020/wordml/sdtdatahash" xmlns:w16se="http://schemas.microsoft.com/office/word/2015/wordml/symex" xmlns:wpg="http://schemas.microsoft.com/office/word/2010/wordprocessingGroup" xmlns:wpi="http://schemas.microsoft.com/office/word/2010/wordprocessingInk" xmlns:wne="http://schemas.microsoft.com/office/word/2006/wordml" xmlns:wps="http://schemas.microsoft.com/office/word/2010/wordprocessingShape" mc:Ignorable="w14 w15 w16se w16cid w16 w16cex w16sdtdh wp14">
   <w:body>
     <w:p>
       <w:pPr>
@@ -1412,7 +1412,6 @@
         </w:rPr>
         <w:t xml:space="preserve"> </w:t>
       </w:r>
-      <w:proofErr w:type="spellStart"/>
       <w:r>
         <w:rPr>
           <w:rFonts w:ascii="Consolas" w:hAnsi="Consolas" w:cs="Cascadia Mono"/>
@@ -1420,17 +1419,7 @@
           <w:bCs/>
           <w:color w:val="000000"/>
         </w:rPr>
-        <w:t>InvalidOperationException</w:t>
-      </w:r>
-      <w:proofErr w:type="spellEnd"/>
-      <w:r>
-        <w:rPr>
-          <w:rFonts w:ascii="Consolas" w:hAnsi="Consolas" w:cs="Cascadia Mono"/>
-          <w:b/>
-          <w:bCs/>
-          <w:color w:val="000000"/>
-        </w:rPr>
-        <w:t>:</w:t>
+        <w:t>InvalidOperationException:</w:t>
       </w:r>
       <w:r>
         <w:rPr>
@@ -7012,21 +7001,7 @@
         <w:rPr>
           <w:rStyle w:val="CodeChar"/>
         </w:rPr>
-        <w:t>M/d/</w:t>
-      </w:r>
-      <w:proofErr w:type="spellStart"/>
-      <w:r>
-        <w:rPr>
-          <w:rStyle w:val="CodeChar"/>
-        </w:rPr>
-        <w:t>yyyy</w:t>
-      </w:r>
-      <w:proofErr w:type="spellEnd"/>
-      <w:r>
-        <w:rPr>
-          <w:rStyle w:val="CodeChar"/>
-        </w:rPr>
-        <w:t xml:space="preserve"> h:mm:ss tt</w:t>
+        <w:t>M/d/yyyy h:mm:ss tt</w:t>
       </w:r>
       <w:bookmarkEnd w:id="67"/>
       <w:bookmarkEnd w:id="68"/>
@@ -7228,34 +7203,24 @@
         </w:rPr>
         <w:t xml:space="preserve"> </w:t>
       </w:r>
-      <w:proofErr w:type="spellStart"/>
+      <w:proofErr w:type="gramStart"/>
       <w:r>
         <w:rPr>
           <w:rFonts w:ascii="Consolas" w:hAnsi="Consolas" w:cstheme="minorHAnsi"/>
           <w:b/>
           <w:bCs/>
         </w:rPr>
-        <w:t>IncreaseSalaries</w:t>
-      </w:r>
-      <w:proofErr w:type="spellEnd"/>
+        <w:t>IncreaseSalaries(</w:t>
+      </w:r>
+      <w:proofErr w:type="gramEnd"/>
       <w:r>
         <w:rPr>
           <w:rFonts w:ascii="Consolas" w:hAnsi="Consolas" w:cstheme="minorHAnsi"/>
           <w:b/>
           <w:bCs/>
         </w:rPr>
-        <w:t>(</w:t>
-      </w:r>
-      <w:proofErr w:type="spellStart"/>
-      <w:r>
-        <w:rPr>
-          <w:rFonts w:ascii="Consolas" w:hAnsi="Consolas" w:cstheme="minorHAnsi"/>
-          <w:b/>
-          <w:bCs/>
-        </w:rPr>
         <w:t>SoftUniContext</w:t>
       </w:r>
-      <w:proofErr w:type="spellEnd"/>
       <w:r>
         <w:rPr>
           <w:rFonts w:cstheme="minorHAnsi"/>
@@ -7296,7 +7261,6 @@
         </w:rPr>
         <w:t xml:space="preserve"> </w:t>
       </w:r>
-      <w:proofErr w:type="spellStart"/>
       <w:r>
         <w:rPr>
           <w:rFonts w:ascii="Consolas" w:hAnsi="Consolas" w:cstheme="minorHAnsi"/>
@@ -7305,7 +7269,6 @@
         </w:rPr>
         <w:t>StartUp</w:t>
       </w:r>
-      <w:proofErr w:type="spellEnd"/>
       <w:r>
         <w:t xml:space="preserve"> class. </w:t>
       </w:r>
@@ -9283,7 +9246,7 @@
 </file>
 
 <file path=word/endnotes.xml><?xml version="1.0" encoding="utf-8"?>
-<w:endnotes xmlns:wpc="http://schemas.microsoft.com/office/word/2010/wordprocessingCanvas" xmlns:cx="http://schemas.microsoft.com/office/drawing/2014/chartex" xmlns:cx1="http://schemas.microsoft.com/office/drawing/2015/9/8/chartex" xmlns:cx2="http://schemas.microsoft.com/office/drawing/2015/10/21/chartex" xmlns:cx3="http://schemas.microsoft.com/office/drawing/2016/5/9/chartex" xmlns:cx4="http://schemas.microsoft.com/office/drawing/2016/5/10/chartex" xmlns:cx5="http://schemas.microsoft.com/office/drawing/2016/5/11/chartex" xmlns:cx6="http://schemas.microsoft.com/office/drawing/2016/5/12/chartex" xmlns:cx7="http://schemas.microsoft.com/office/drawing/2016/5/13/chartex" xmlns:cx8="http://schemas.microsoft.com/office/drawing/2016/5/14/chartex" xmlns:mc="http://schemas.openxmlformats.org/markup-compatibility/2006" xmlns:aink="http://schemas.microsoft.com/office/drawing/2016/ink" xmlns:am3d="http://schemas.microsoft.com/office/drawing/2017/model3d" xmlns:o="urn:schemas-microsoft-com:office:office" xmlns:oel="http://schemas.microsoft.com/office/2019/extlst" xmlns:r="http://schemas.openxmlformats.org/officeDocument/2006/relationships" xmlns:m="http://schemas.openxmlformats.org/officeDocument/2006/math" xmlns:v="urn:schemas-microsoft-com:vml" xmlns:wp14="http://schemas.microsoft.com/office/word/2010/wordprocessingDrawing" xmlns:wp="http://schemas.openxmlformats.org/drawingml/2006/wordprocessingDrawing" xmlns:w10="urn:schemas-microsoft-com:office:word" xmlns:w="http://schemas.openxmlformats.org/wordprocessingml/2006/main" xmlns:w14="http://schemas.microsoft.com/office/word/2010/wordml" xmlns:w15="http://schemas.microsoft.com/office/word/2012/wordml" xmlns:w16cex="http://schemas.microsoft.com/office/word/2018/wordml/cex" xmlns:w16cid="http://schemas.microsoft.com/office/word/2016/wordml/cid" xmlns:w16="http://schemas.microsoft.com/office/word/2018/wordml" xmlns:w16du="http://schemas.microsoft.com/office/word/2023/wordml/word16du" xmlns:w16sdtdh="http://schemas.microsoft.com/office/word/2020/wordml/sdtdatahash" xmlns:w16sdtfl="http://schemas.microsoft.com/office/word/2024/wordml/sdtformatlock" xmlns:w16se="http://schemas.microsoft.com/office/word/2015/wordml/symex" xmlns:wpg="http://schemas.microsoft.com/office/word/2010/wordprocessingGroup" xmlns:wpi="http://schemas.microsoft.com/office/word/2010/wordprocessingInk" xmlns:wne="http://schemas.microsoft.com/office/word/2006/wordml" xmlns:wps="http://schemas.microsoft.com/office/word/2010/wordprocessingShape" mc:Ignorable="w14 w15 w16se w16cid w16 w16cex w16sdtdh w16sdtfl w16du wp14">
+<w:endnotes xmlns:wpc="http://schemas.microsoft.com/office/word/2010/wordprocessingCanvas" xmlns:cx="http://schemas.microsoft.com/office/drawing/2014/chartex" xmlns:cx1="http://schemas.microsoft.com/office/drawing/2015/9/8/chartex" xmlns:cx2="http://schemas.microsoft.com/office/drawing/2015/10/21/chartex" xmlns:cx3="http://schemas.microsoft.com/office/drawing/2016/5/9/chartex" xmlns:cx4="http://schemas.microsoft.com/office/drawing/2016/5/10/chartex" xmlns:cx5="http://schemas.microsoft.com/office/drawing/2016/5/11/chartex" xmlns:cx6="http://schemas.microsoft.com/office/drawing/2016/5/12/chartex" xmlns:cx7="http://schemas.microsoft.com/office/drawing/2016/5/13/chartex" xmlns:cx8="http://schemas.microsoft.com/office/drawing/2016/5/14/chartex" xmlns:mc="http://schemas.openxmlformats.org/markup-compatibility/2006" xmlns:aink="http://schemas.microsoft.com/office/drawing/2016/ink" xmlns:am3d="http://schemas.microsoft.com/office/drawing/2017/model3d" xmlns:o="urn:schemas-microsoft-com:office:office" xmlns:oel="http://schemas.microsoft.com/office/2019/extlst" xmlns:r="http://schemas.openxmlformats.org/officeDocument/2006/relationships" xmlns:m="http://schemas.openxmlformats.org/officeDocument/2006/math" xmlns:v="urn:schemas-microsoft-com:vml" xmlns:wp14="http://schemas.microsoft.com/office/word/2010/wordprocessingDrawing" xmlns:wp="http://schemas.openxmlformats.org/drawingml/2006/wordprocessingDrawing" xmlns:w10="urn:schemas-microsoft-com:office:word" xmlns:w="http://schemas.openxmlformats.org/wordprocessingml/2006/main" xmlns:w14="http://schemas.microsoft.com/office/word/2010/wordml" xmlns:w15="http://schemas.microsoft.com/office/word/2012/wordml" xmlns:w16cex="http://schemas.microsoft.com/office/word/2018/wordml/cex" xmlns:w16cid="http://schemas.microsoft.com/office/word/2016/wordml/cid" xmlns:w16="http://schemas.microsoft.com/office/word/2018/wordml" xmlns:w16sdtdh="http://schemas.microsoft.com/office/word/2020/wordml/sdtdatahash" xmlns:w16se="http://schemas.microsoft.com/office/word/2015/wordml/symex" xmlns:wpg="http://schemas.microsoft.com/office/word/2010/wordprocessingGroup" xmlns:wpi="http://schemas.microsoft.com/office/word/2010/wordprocessingInk" xmlns:wne="http://schemas.microsoft.com/office/word/2006/wordml" xmlns:wps="http://schemas.microsoft.com/office/word/2010/wordprocessingShape" mc:Ignorable="w14 w15 w16se w16cid w16 w16cex w16sdtdh wp14">
   <w:endnote w:type="separator" w:id="-1">
     <w:p>
       <w:pPr>
@@ -9308,7 +9271,7 @@
 </file>
 
 <file path=word/footer1.xml><?xml version="1.0" encoding="utf-8"?>
-<w:ftr xmlns:wpc="http://schemas.microsoft.com/office/word/2010/wordprocessingCanvas" xmlns:cx="http://schemas.microsoft.com/office/drawing/2014/chartex" xmlns:cx1="http://schemas.microsoft.com/office/drawing/2015/9/8/chartex" xmlns:cx2="http://schemas.microsoft.com/office/drawing/2015/10/21/chartex" xmlns:cx3="http://schemas.microsoft.com/office/drawing/2016/5/9/chartex" xmlns:cx4="http://schemas.microsoft.com/office/drawing/2016/5/10/chartex" xmlns:cx5="http://schemas.microsoft.com/office/drawing/2016/5/11/chartex" xmlns:cx6="http://schemas.microsoft.com/office/drawing/2016/5/12/chartex" xmlns:cx7="http://schemas.microsoft.com/office/drawing/2016/5/13/chartex" xmlns:cx8="http://schemas.microsoft.com/office/drawing/2016/5/14/chartex" xmlns:mc="http://schemas.openxmlformats.org/markup-compatibility/2006" xmlns:aink="http://schemas.microsoft.com/office/drawing/2016/ink" xmlns:am3d="http://schemas.microsoft.com/office/drawing/2017/model3d" xmlns:o="urn:schemas-microsoft-com:office:office" xmlns:oel="http://schemas.microsoft.com/office/2019/extlst" xmlns:r="http://schemas.openxmlformats.org/officeDocument/2006/relationships" xmlns:m="http://schemas.openxmlformats.org/officeDocument/2006/math" xmlns:v="urn:schemas-microsoft-com:vml" xmlns:wp14="http://schemas.microsoft.com/office/word/2010/wordprocessingDrawing" xmlns:wp="http://schemas.openxmlformats.org/drawingml/2006/wordprocessingDrawing" xmlns:w10="urn:schemas-microsoft-com:office:word" xmlns:w="http://schemas.openxmlformats.org/wordprocessingml/2006/main" xmlns:w14="http://schemas.microsoft.com/office/word/2010/wordml" xmlns:w15="http://schemas.microsoft.com/office/word/2012/wordml" xmlns:w16cex="http://schemas.microsoft.com/office/word/2018/wordml/cex" xmlns:w16cid="http://schemas.microsoft.com/office/word/2016/wordml/cid" xmlns:w16="http://schemas.microsoft.com/office/word/2018/wordml" xmlns:w16du="http://schemas.microsoft.com/office/word/2023/wordml/word16du" xmlns:w16sdtdh="http://schemas.microsoft.com/office/word/2020/wordml/sdtdatahash" xmlns:w16sdtfl="http://schemas.microsoft.com/office/word/2024/wordml/sdtformatlock" xmlns:w16se="http://schemas.microsoft.com/office/word/2015/wordml/symex" xmlns:wpg="http://schemas.microsoft.com/office/word/2010/wordprocessingGroup" xmlns:wpi="http://schemas.microsoft.com/office/word/2010/wordprocessingInk" xmlns:wne="http://schemas.microsoft.com/office/word/2006/wordml" xmlns:wps="http://schemas.microsoft.com/office/word/2010/wordprocessingShape" mc:Ignorable="w14 w15 w16se w16cid w16 w16cex w16sdtdh w16sdtfl w16du wp14">
+<w:ftr xmlns:wpc="http://schemas.microsoft.com/office/word/2010/wordprocessingCanvas" xmlns:cx="http://schemas.microsoft.com/office/drawing/2014/chartex" xmlns:cx1="http://schemas.microsoft.com/office/drawing/2015/9/8/chartex" xmlns:cx2="http://schemas.microsoft.com/office/drawing/2015/10/21/chartex" xmlns:cx3="http://schemas.microsoft.com/office/drawing/2016/5/9/chartex" xmlns:cx4="http://schemas.microsoft.com/office/drawing/2016/5/10/chartex" xmlns:cx5="http://schemas.microsoft.com/office/drawing/2016/5/11/chartex" xmlns:cx6="http://schemas.microsoft.com/office/drawing/2016/5/12/chartex" xmlns:cx7="http://schemas.microsoft.com/office/drawing/2016/5/13/chartex" xmlns:cx8="http://schemas.microsoft.com/office/drawing/2016/5/14/chartex" xmlns:mc="http://schemas.openxmlformats.org/markup-compatibility/2006" xmlns:aink="http://schemas.microsoft.com/office/drawing/2016/ink" xmlns:am3d="http://schemas.microsoft.com/office/drawing/2017/model3d" xmlns:o="urn:schemas-microsoft-com:office:office" xmlns:oel="http://schemas.microsoft.com/office/2019/extlst" xmlns:r="http://schemas.openxmlformats.org/officeDocument/2006/relationships" xmlns:m="http://schemas.openxmlformats.org/officeDocument/2006/math" xmlns:v="urn:schemas-microsoft-com:vml" xmlns:wp14="http://schemas.microsoft.com/office/word/2010/wordprocessingDrawing" xmlns:wp="http://schemas.openxmlformats.org/drawingml/2006/wordprocessingDrawing" xmlns:w10="urn:schemas-microsoft-com:office:word" xmlns:w="http://schemas.openxmlformats.org/wordprocessingml/2006/main" xmlns:w14="http://schemas.microsoft.com/office/word/2010/wordml" xmlns:w15="http://schemas.microsoft.com/office/word/2012/wordml" xmlns:w16cex="http://schemas.microsoft.com/office/word/2018/wordml/cex" xmlns:w16cid="http://schemas.microsoft.com/office/word/2016/wordml/cid" xmlns:w16="http://schemas.microsoft.com/office/word/2018/wordml" xmlns:w16sdtdh="http://schemas.microsoft.com/office/word/2020/wordml/sdtdatahash" xmlns:w16se="http://schemas.microsoft.com/office/word/2015/wordml/symex" xmlns:wpg="http://schemas.microsoft.com/office/word/2010/wordprocessingGroup" xmlns:wpi="http://schemas.microsoft.com/office/word/2010/wordprocessingInk" xmlns:wne="http://schemas.microsoft.com/office/word/2006/wordml" xmlns:wps="http://schemas.microsoft.com/office/word/2010/wordprocessingShape" mc:Ignorable="w14 w15 w16se w16cid w16 w16cex w16sdtdh wp14">
   <w:p>
     <w:pPr>
       <w:pStyle w:val="Footer"/>
@@ -10350,14 +10313,14 @@
                               <pic:pic xmlns:pic="http://schemas.openxmlformats.org/drawingml/2006/picture">
                                 <pic:nvPicPr>
                                   <pic:cNvPr id="3" name="Picture 3">
-                                    <a:hlinkClick r:id="rId20"/>
+                                    <a:hlinkClick r:id="rId1"/>
                                   </pic:cNvPr>
                                   <pic:cNvPicPr>
                                     <a:picLocks noChangeAspect="1" noChangeArrowheads="1"/>
                                   </pic:cNvPicPr>
                                 </pic:nvPicPr>
                                 <pic:blipFill>
-                                  <a:blip r:embed="rId21">
+                                  <a:blip r:embed="rId2">
                                     <a:extLst>
                                       <a:ext uri="{28A0092B-C50C-407E-A947-70E740481C1C}">
                                         <a14:useLocalDpi xmlns:a14="http://schemas.microsoft.com/office/drawing/2010/main" val="0"/>
@@ -10407,7 +10370,7 @@
                           <wp:extent cx="180000" cy="180000"/>
                           <wp:effectExtent l="0" t="0" r="0" b="0"/>
                           <wp:docPr id="2" name="Picture 2">
-                            <a:hlinkClick xmlns:a="http://schemas.openxmlformats.org/drawingml/2006/main" r:id="rId22"/>
+                            <a:hlinkClick xmlns:a="http://schemas.openxmlformats.org/drawingml/2006/main" r:id="rId3"/>
                           </wp:docPr>
                           <wp:cNvGraphicFramePr>
                             <a:graphicFrameLocks xmlns:a="http://schemas.openxmlformats.org/drawingml/2006/main" noChangeAspect="1"/>
@@ -10417,14 +10380,14 @@
                               <pic:pic xmlns:pic="http://schemas.openxmlformats.org/drawingml/2006/picture">
                                 <pic:nvPicPr>
                                   <pic:cNvPr id="2" name="Picture 2">
-                                    <a:hlinkClick r:id="rId22"/>
+                                    <a:hlinkClick r:id="rId3"/>
                                   </pic:cNvPr>
                                   <pic:cNvPicPr>
                                     <a:picLocks noChangeAspect="1" noChangeArrowheads="1"/>
                                   </pic:cNvPicPr>
                                 </pic:nvPicPr>
                                 <pic:blipFill>
-                                  <a:blip r:embed="rId23">
+                                  <a:blip r:embed="rId4">
                                     <a:extLst>
                                       <a:ext uri="{28A0092B-C50C-407E-A947-70E740481C1C}">
                                         <a14:useLocalDpi xmlns:a14="http://schemas.microsoft.com/office/drawing/2010/main" val="0"/>
@@ -10474,7 +10437,7 @@
                           <wp:extent cx="180000" cy="180000"/>
                           <wp:effectExtent l="0" t="0" r="0" b="0"/>
                           <wp:docPr id="5" name="Picture 5" title="Software University @ Facebook">
-                            <a:hlinkClick xmlns:a="http://schemas.openxmlformats.org/drawingml/2006/main" r:id="rId24"/>
+                            <a:hlinkClick xmlns:a="http://schemas.openxmlformats.org/drawingml/2006/main" r:id="rId5"/>
                           </wp:docPr>
                           <wp:cNvGraphicFramePr>
                             <a:graphicFrameLocks xmlns:a="http://schemas.openxmlformats.org/drawingml/2006/main" noChangeAspect="1"/>
@@ -10484,12 +10447,12 @@
                               <pic:pic xmlns:pic="http://schemas.openxmlformats.org/drawingml/2006/picture">
                                 <pic:nvPicPr>
                                   <pic:cNvPr id="5" name="Picture 5" title="Software University @ Facebook">
-                                    <a:hlinkClick r:id="rId24"/>
+                                    <a:hlinkClick r:id="rId5"/>
                                   </pic:cNvPr>
                                   <pic:cNvPicPr/>
                                 </pic:nvPicPr>
                                 <pic:blipFill>
-                                  <a:blip r:embed="rId25"/>
+                                  <a:blip r:embed="rId6"/>
                                   <a:stretch>
                                     <a:fillRect/>
                                   </a:stretch>
@@ -10528,7 +10491,7 @@
                           <wp:extent cx="180000" cy="180000"/>
                           <wp:effectExtent l="0" t="0" r="0" b="0"/>
                           <wp:docPr id="20" name="Picture 20">
-                            <a:hlinkClick xmlns:a="http://schemas.openxmlformats.org/drawingml/2006/main" r:id="rId26"/>
+                            <a:hlinkClick xmlns:a="http://schemas.openxmlformats.org/drawingml/2006/main" r:id="rId7"/>
                           </wp:docPr>
                           <wp:cNvGraphicFramePr>
                             <a:graphicFrameLocks xmlns:a="http://schemas.openxmlformats.org/drawingml/2006/main" noChangeAspect="1"/>
@@ -10538,20 +10501,20 @@
                               <pic:pic xmlns:pic="http://schemas.openxmlformats.org/drawingml/2006/picture">
                                 <pic:nvPicPr>
                                   <pic:cNvPr id="20" name="Picture 20">
-                                    <a:hlinkClick r:id="rId26"/>
+                                    <a:hlinkClick r:id="rId7"/>
                                   </pic:cNvPr>
                                   <pic:cNvPicPr>
                                     <a:picLocks noChangeAspect="1" noChangeArrowheads="1"/>
                                   </pic:cNvPicPr>
                                 </pic:nvPicPr>
                                 <pic:blipFill>
-                                  <a:blip r:embed="rId27">
+                                  <a:blip r:embed="rId8">
                                     <a:extLst>
                                       <a:ext uri="{28A0092B-C50C-407E-A947-70E740481C1C}">
                                         <a14:useLocalDpi xmlns:a14="http://schemas.microsoft.com/office/drawing/2010/main" val="0"/>
                                       </a:ext>
                                       <a:ext uri="{837473B0-CC2E-450A-ABE3-18F120FF3D39}">
-                                        <a1611:picAttrSrcUrl xmlns:a1611="http://schemas.microsoft.com/office/drawing/2016/11/main" r:id="rId28"/>
+                                        <a1611:picAttrSrcUrl xmlns:a1611="http://schemas.microsoft.com/office/drawing/2016/11/main" r:id="rId9"/>
                                       </a:ext>
                                     </a:extLst>
                                   </a:blip>
@@ -10598,7 +10561,7 @@
                           <wp:extent cx="180000" cy="180000"/>
                           <wp:effectExtent l="0" t="0" r="0" b="0"/>
                           <wp:docPr id="7" name="Picture 7" title="Software University @ Twitter">
-                            <a:hlinkClick xmlns:a="http://schemas.openxmlformats.org/drawingml/2006/main" r:id="rId29"/>
+                            <a:hlinkClick xmlns:a="http://schemas.openxmlformats.org/drawingml/2006/main" r:id="rId10"/>
                           </wp:docPr>
                           <wp:cNvGraphicFramePr>
                             <a:graphicFrameLocks xmlns:a="http://schemas.openxmlformats.org/drawingml/2006/main" noChangeAspect="1"/>
@@ -10608,12 +10571,12 @@
                               <pic:pic xmlns:pic="http://schemas.openxmlformats.org/drawingml/2006/picture">
                                 <pic:nvPicPr>
                                   <pic:cNvPr id="7" name="Picture 7" title="Software University @ Twitter">
-                                    <a:hlinkClick r:id="rId29"/>
+                                    <a:hlinkClick r:id="rId10"/>
                                   </pic:cNvPr>
                                   <pic:cNvPicPr/>
                                 </pic:nvPicPr>
                                 <pic:blipFill>
-                                  <a:blip r:embed="rId30"/>
+                                  <a:blip r:embed="rId11"/>
                                   <a:stretch>
                                     <a:fillRect/>
                                   </a:stretch>
@@ -10652,7 +10615,7 @@
                           <wp:extent cx="180000" cy="180000"/>
                           <wp:effectExtent l="0" t="0" r="0" b="0"/>
                           <wp:docPr id="17" name="Picture 17" title="Software University @ YouTube">
-                            <a:hlinkClick xmlns:a="http://schemas.openxmlformats.org/drawingml/2006/main" r:id="rId31"/>
+                            <a:hlinkClick xmlns:a="http://schemas.openxmlformats.org/drawingml/2006/main" r:id="rId12"/>
                           </wp:docPr>
                           <wp:cNvGraphicFramePr>
                             <a:graphicFrameLocks xmlns:a="http://schemas.openxmlformats.org/drawingml/2006/main" noChangeAspect="1"/>
@@ -10662,12 +10625,12 @@
                               <pic:pic xmlns:pic="http://schemas.openxmlformats.org/drawingml/2006/picture">
                                 <pic:nvPicPr>
                                   <pic:cNvPr id="17" name="Picture 17" title="Software University @ YouTube">
-                                    <a:hlinkClick r:id="rId31"/>
+                                    <a:hlinkClick r:id="rId12"/>
                                   </pic:cNvPr>
                                   <pic:cNvPicPr/>
                                 </pic:nvPicPr>
                                 <pic:blipFill>
-                                  <a:blip r:embed="rId32"/>
+                                  <a:blip r:embed="rId13"/>
                                   <a:stretch>
                                     <a:fillRect/>
                                   </a:stretch>
@@ -10706,7 +10669,7 @@
                           <wp:extent cx="180000" cy="180000"/>
                           <wp:effectExtent l="0" t="0" r="0" b="0"/>
                           <wp:docPr id="21" name="Picture 21">
-                            <a:hlinkClick xmlns:a="http://schemas.openxmlformats.org/drawingml/2006/main" r:id="rId33"/>
+                            <a:hlinkClick xmlns:a="http://schemas.openxmlformats.org/drawingml/2006/main" r:id="rId14"/>
                           </wp:docPr>
                           <wp:cNvGraphicFramePr>
                             <a:graphicFrameLocks xmlns:a="http://schemas.openxmlformats.org/drawingml/2006/main" noChangeAspect="1"/>
@@ -10716,14 +10679,14 @@
                               <pic:pic xmlns:pic="http://schemas.openxmlformats.org/drawingml/2006/picture">
                                 <pic:nvPicPr>
                                   <pic:cNvPr id="21" name="Picture 21">
-                                    <a:hlinkClick r:id="rId33"/>
+                                    <a:hlinkClick r:id="rId14"/>
                                   </pic:cNvPr>
                                   <pic:cNvPicPr>
                                     <a:picLocks noChangeAspect="1" noChangeArrowheads="1"/>
                                   </pic:cNvPicPr>
                                 </pic:nvPicPr>
                                 <pic:blipFill rotWithShape="1">
-                                  <a:blip r:embed="rId34">
+                                  <a:blip r:embed="rId15">
                                     <a:extLst>
                                       <a:ext uri="{28A0092B-C50C-407E-A947-70E740481C1C}">
                                         <a14:useLocalDpi xmlns:a14="http://schemas.microsoft.com/office/drawing/2010/main" val="0"/>
@@ -10776,7 +10739,7 @@
                           <wp:extent cx="180000" cy="180000"/>
                           <wp:effectExtent l="0" t="0" r="0" b="0"/>
                           <wp:docPr id="22" name="Picture 22">
-                            <a:hlinkClick xmlns:a="http://schemas.openxmlformats.org/drawingml/2006/main" r:id="rId35"/>
+                            <a:hlinkClick xmlns:a="http://schemas.openxmlformats.org/drawingml/2006/main" r:id="rId16"/>
                           </wp:docPr>
                           <wp:cNvGraphicFramePr>
                             <a:graphicFrameLocks xmlns:a="http://schemas.openxmlformats.org/drawingml/2006/main" noChangeAspect="1"/>
@@ -10786,14 +10749,14 @@
                               <pic:pic xmlns:pic="http://schemas.openxmlformats.org/drawingml/2006/picture">
                                 <pic:nvPicPr>
                                   <pic:cNvPr id="22" name="Picture 22">
-                                    <a:hlinkClick r:id="rId35"/>
+                                    <a:hlinkClick r:id="rId16"/>
                                   </pic:cNvPr>
                                   <pic:cNvPicPr>
                                     <a:picLocks noChangeAspect="1" noChangeArrowheads="1"/>
                                   </pic:cNvPicPr>
                                 </pic:nvPicPr>
                                 <pic:blipFill>
-                                  <a:blip r:embed="rId36">
+                                  <a:blip r:embed="rId17">
                                     <a:extLst>
                                       <a:ext uri="{28A0092B-C50C-407E-A947-70E740481C1C}">
                                         <a14:useLocalDpi xmlns:a14="http://schemas.microsoft.com/office/drawing/2010/main" val="0"/>
@@ -10843,7 +10806,7 @@
                           <wp:extent cx="180000" cy="180000"/>
                           <wp:effectExtent l="0" t="0" r="0" b="0"/>
                           <wp:docPr id="23" name="Picture 23" title="Software University: Email Us">
-                            <a:hlinkClick xmlns:a="http://schemas.openxmlformats.org/drawingml/2006/main" r:id="rId37"/>
+                            <a:hlinkClick xmlns:a="http://schemas.openxmlformats.org/drawingml/2006/main" r:id="rId18"/>
                           </wp:docPr>
                           <wp:cNvGraphicFramePr>
                             <a:graphicFrameLocks xmlns:a="http://schemas.openxmlformats.org/drawingml/2006/main" noChangeAspect="1"/>
@@ -10853,12 +10816,12 @@
                               <pic:pic xmlns:pic="http://schemas.openxmlformats.org/drawingml/2006/picture">
                                 <pic:nvPicPr>
                                   <pic:cNvPr id="23" name="Picture 23" title="Software University: Email Us">
-                                    <a:hlinkClick r:id="rId37"/>
+                                    <a:hlinkClick r:id="rId18"/>
                                   </pic:cNvPr>
                                   <pic:cNvPicPr/>
                                 </pic:nvPicPr>
                                 <pic:blipFill>
-                                  <a:blip r:embed="rId38"/>
+                                  <a:blip r:embed="rId19"/>
                                   <a:stretch>
                                     <a:fillRect/>
                                   </a:stretch>
@@ -10921,7 +10884,7 @@
                   </pic:cNvPicPr>
                 </pic:nvPicPr>
                 <pic:blipFill>
-                  <a:blip r:embed="rId39">
+                  <a:blip r:embed="rId21">
                     <a:extLst>
                       <a:ext uri="{28A0092B-C50C-407E-A947-70E740481C1C}">
                         <a14:useLocalDpi xmlns:a14="http://schemas.microsoft.com/office/drawing/2010/main" val="0"/>
@@ -11026,7 +10989,7 @@
             </wp:anchor>
           </w:drawing>
         </mc:Choice>
-        <mc:Fallback>
+        <mc:Fallback xmlns:w16sdtfl="http://schemas.microsoft.com/office/word/2024/wordml/sdtformatlock" xmlns:w16du="http://schemas.microsoft.com/office/word/2023/wordml/word16du">
           <w:pict>
             <v:line w14:anchorId="60BE7D18" id="Straight Connector 19" o:spid="_x0000_s1026" style="position:absolute;flip:y;z-index:251622400;visibility:visible;mso-wrap-style:square;mso-width-percent:0;mso-height-percent:0;mso-wrap-distance-left:9pt;mso-wrap-distance-top:0;mso-wrap-distance-right:9pt;mso-wrap-distance-bottom:0;mso-position-horizontal:absolute;mso-position-horizontal-relative:text;mso-position-vertical:absolute;mso-position-vertical-relative:text;mso-width-percent:0;mso-height-percent:0;mso-width-relative:page;mso-height-relative:page" from="-.1pt,5.2pt" to="520.7pt,5.2pt" o:gfxdata="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" strokecolor="#974706 [1609]" strokeweight="1pt">
               <v:stroke endcap="round"/>
@@ -11319,7 +11282,7 @@
 </file>
 
 <file path=word/footnotes.xml><?xml version="1.0" encoding="utf-8"?>
-<w:footnotes xmlns:wpc="http://schemas.microsoft.com/office/word/2010/wordprocessingCanvas" xmlns:cx="http://schemas.microsoft.com/office/drawing/2014/chartex" xmlns:cx1="http://schemas.microsoft.com/office/drawing/2015/9/8/chartex" xmlns:cx2="http://schemas.microsoft.com/office/drawing/2015/10/21/chartex" xmlns:cx3="http://schemas.microsoft.com/office/drawing/2016/5/9/chartex" xmlns:cx4="http://schemas.microsoft.com/office/drawing/2016/5/10/chartex" xmlns:cx5="http://schemas.microsoft.com/office/drawing/2016/5/11/chartex" xmlns:cx6="http://schemas.microsoft.com/office/drawing/2016/5/12/chartex" xmlns:cx7="http://schemas.microsoft.com/office/drawing/2016/5/13/chartex" xmlns:cx8="http://schemas.microsoft.com/office/drawing/2016/5/14/chartex" xmlns:mc="http://schemas.openxmlformats.org/markup-compatibility/2006" xmlns:aink="http://schemas.microsoft.com/office/drawing/2016/ink" xmlns:am3d="http://schemas.microsoft.com/office/drawing/2017/model3d" xmlns:o="urn:schemas-microsoft-com:office:office" xmlns:oel="http://schemas.microsoft.com/office/2019/extlst" xmlns:r="http://schemas.openxmlformats.org/officeDocument/2006/relationships" xmlns:m="http://schemas.openxmlformats.org/officeDocument/2006/math" xmlns:v="urn:schemas-microsoft-com:vml" xmlns:wp14="http://schemas.microsoft.com/office/word/2010/wordprocessingDrawing" xmlns:wp="http://schemas.openxmlformats.org/drawingml/2006/wordprocessingDrawing" xmlns:w10="urn:schemas-microsoft-com:office:word" xmlns:w="http://schemas.openxmlformats.org/wordprocessingml/2006/main" xmlns:w14="http://schemas.microsoft.com/office/word/2010/wordml" xmlns:w15="http://schemas.microsoft.com/office/word/2012/wordml" xmlns:w16cex="http://schemas.microsoft.com/office/word/2018/wordml/cex" xmlns:w16cid="http://schemas.microsoft.com/office/word/2016/wordml/cid" xmlns:w16="http://schemas.microsoft.com/office/word/2018/wordml" xmlns:w16du="http://schemas.microsoft.com/office/word/2023/wordml/word16du" xmlns:w16sdtdh="http://schemas.microsoft.com/office/word/2020/wordml/sdtdatahash" xmlns:w16sdtfl="http://schemas.microsoft.com/office/word/2024/wordml/sdtformatlock" xmlns:w16se="http://schemas.microsoft.com/office/word/2015/wordml/symex" xmlns:wpg="http://schemas.microsoft.com/office/word/2010/wordprocessingGroup" xmlns:wpi="http://schemas.microsoft.com/office/word/2010/wordprocessingInk" xmlns:wne="http://schemas.microsoft.com/office/word/2006/wordml" xmlns:wps="http://schemas.microsoft.com/office/word/2010/wordprocessingShape" mc:Ignorable="w14 w15 w16se w16cid w16 w16cex w16sdtdh w16sdtfl w16du wp14">
+<w:footnotes xmlns:wpc="http://schemas.microsoft.com/office/word/2010/wordprocessingCanvas" xmlns:cx="http://schemas.microsoft.com/office/drawing/2014/chartex" xmlns:cx1="http://schemas.microsoft.com/office/drawing/2015/9/8/chartex" xmlns:cx2="http://schemas.microsoft.com/office/drawing/2015/10/21/chartex" xmlns:cx3="http://schemas.microsoft.com/office/drawing/2016/5/9/chartex" xmlns:cx4="http://schemas.microsoft.com/office/drawing/2016/5/10/chartex" xmlns:cx5="http://schemas.microsoft.com/office/drawing/2016/5/11/chartex" xmlns:cx6="http://schemas.microsoft.com/office/drawing/2016/5/12/chartex" xmlns:cx7="http://schemas.microsoft.com/office/drawing/2016/5/13/chartex" xmlns:cx8="http://schemas.microsoft.com/office/drawing/2016/5/14/chartex" xmlns:mc="http://schemas.openxmlformats.org/markup-compatibility/2006" xmlns:aink="http://schemas.microsoft.com/office/drawing/2016/ink" xmlns:am3d="http://schemas.microsoft.com/office/drawing/2017/model3d" xmlns:o="urn:schemas-microsoft-com:office:office" xmlns:oel="http://schemas.microsoft.com/office/2019/extlst" xmlns:r="http://schemas.openxmlformats.org/officeDocument/2006/relationships" xmlns:m="http://schemas.openxmlformats.org/officeDocument/2006/math" xmlns:v="urn:schemas-microsoft-com:vml" xmlns:wp14="http://schemas.microsoft.com/office/word/2010/wordprocessingDrawing" xmlns:wp="http://schemas.openxmlformats.org/drawingml/2006/wordprocessingDrawing" xmlns:w10="urn:schemas-microsoft-com:office:word" xmlns:w="http://schemas.openxmlformats.org/wordprocessingml/2006/main" xmlns:w14="http://schemas.microsoft.com/office/word/2010/wordml" xmlns:w15="http://schemas.microsoft.com/office/word/2012/wordml" xmlns:w16cex="http://schemas.microsoft.com/office/word/2018/wordml/cex" xmlns:w16cid="http://schemas.microsoft.com/office/word/2016/wordml/cid" xmlns:w16="http://schemas.microsoft.com/office/word/2018/wordml" xmlns:w16sdtdh="http://schemas.microsoft.com/office/word/2020/wordml/sdtdatahash" xmlns:w16se="http://schemas.microsoft.com/office/word/2015/wordml/symex" xmlns:wpg="http://schemas.microsoft.com/office/word/2010/wordprocessingGroup" xmlns:wpi="http://schemas.microsoft.com/office/word/2010/wordprocessingInk" xmlns:wne="http://schemas.microsoft.com/office/word/2006/wordml" xmlns:wps="http://schemas.microsoft.com/office/word/2010/wordprocessingShape" mc:Ignorable="w14 w15 w16se w16cid w16 w16cex w16sdtdh wp14">
   <w:footnote w:type="separator" w:id="-1">
     <w:p>
       <w:pPr>
@@ -11344,7 +11307,7 @@
 </file>
 
 <file path=word/header1.xml><?xml version="1.0" encoding="utf-8"?>
-<w:hdr xmlns:wpc="http://schemas.microsoft.com/office/word/2010/wordprocessingCanvas" xmlns:cx="http://schemas.microsoft.com/office/drawing/2014/chartex" xmlns:cx1="http://schemas.microsoft.com/office/drawing/2015/9/8/chartex" xmlns:cx2="http://schemas.microsoft.com/office/drawing/2015/10/21/chartex" xmlns:cx3="http://schemas.microsoft.com/office/drawing/2016/5/9/chartex" xmlns:cx4="http://schemas.microsoft.com/office/drawing/2016/5/10/chartex" xmlns:cx5="http://schemas.microsoft.com/office/drawing/2016/5/11/chartex" xmlns:cx6="http://schemas.microsoft.com/office/drawing/2016/5/12/chartex" xmlns:cx7="http://schemas.microsoft.com/office/drawing/2016/5/13/chartex" xmlns:cx8="http://schemas.microsoft.com/office/drawing/2016/5/14/chartex" xmlns:mc="http://schemas.openxmlformats.org/markup-compatibility/2006" xmlns:aink="http://schemas.microsoft.com/office/drawing/2016/ink" xmlns:am3d="http://schemas.microsoft.com/office/drawing/2017/model3d" xmlns:o="urn:schemas-microsoft-com:office:office" xmlns:oel="http://schemas.microsoft.com/office/2019/extlst" xmlns:r="http://schemas.openxmlformats.org/officeDocument/2006/relationships" xmlns:m="http://schemas.openxmlformats.org/officeDocument/2006/math" xmlns:v="urn:schemas-microsoft-com:vml" xmlns:wp14="http://schemas.microsoft.com/office/word/2010/wordprocessingDrawing" xmlns:wp="http://schemas.openxmlformats.org/drawingml/2006/wordprocessingDrawing" xmlns:w10="urn:schemas-microsoft-com:office:word" xmlns:w="http://schemas.openxmlformats.org/wordprocessingml/2006/main" xmlns:w14="http://schemas.microsoft.com/office/word/2010/wordml" xmlns:w15="http://schemas.microsoft.com/office/word/2012/wordml" xmlns:w16cex="http://schemas.microsoft.com/office/word/2018/wordml/cex" xmlns:w16cid="http://schemas.microsoft.com/office/word/2016/wordml/cid" xmlns:w16="http://schemas.microsoft.com/office/word/2018/wordml" xmlns:w16du="http://schemas.microsoft.com/office/word/2023/wordml/word16du" xmlns:w16sdtdh="http://schemas.microsoft.com/office/word/2020/wordml/sdtdatahash" xmlns:w16sdtfl="http://schemas.microsoft.com/office/word/2024/wordml/sdtformatlock" xmlns:w16se="http://schemas.microsoft.com/office/word/2015/wordml/symex" xmlns:wpg="http://schemas.microsoft.com/office/word/2010/wordprocessingGroup" xmlns:wpi="http://schemas.microsoft.com/office/word/2010/wordprocessingInk" xmlns:wne="http://schemas.microsoft.com/office/word/2006/wordml" xmlns:wps="http://schemas.microsoft.com/office/word/2010/wordprocessingShape" mc:Ignorable="w14 w15 w16se w16cid w16 w16cex w16sdtdh w16sdtfl w16du wp14">
+<w:hdr xmlns:wpc="http://schemas.microsoft.com/office/word/2010/wordprocessingCanvas" xmlns:cx="http://schemas.microsoft.com/office/drawing/2014/chartex" xmlns:cx1="http://schemas.microsoft.com/office/drawing/2015/9/8/chartex" xmlns:cx2="http://schemas.microsoft.com/office/drawing/2015/10/21/chartex" xmlns:cx3="http://schemas.microsoft.com/office/drawing/2016/5/9/chartex" xmlns:cx4="http://schemas.microsoft.com/office/drawing/2016/5/10/chartex" xmlns:cx5="http://schemas.microsoft.com/office/drawing/2016/5/11/chartex" xmlns:cx6="http://schemas.microsoft.com/office/drawing/2016/5/12/chartex" xmlns:cx7="http://schemas.microsoft.com/office/drawing/2016/5/13/chartex" xmlns:cx8="http://schemas.microsoft.com/office/drawing/2016/5/14/chartex" xmlns:mc="http://schemas.openxmlformats.org/markup-compatibility/2006" xmlns:aink="http://schemas.microsoft.com/office/drawing/2016/ink" xmlns:am3d="http://schemas.microsoft.com/office/drawing/2017/model3d" xmlns:o="urn:schemas-microsoft-com:office:office" xmlns:oel="http://schemas.microsoft.com/office/2019/extlst" xmlns:r="http://schemas.openxmlformats.org/officeDocument/2006/relationships" xmlns:m="http://schemas.openxmlformats.org/officeDocument/2006/math" xmlns:v="urn:schemas-microsoft-com:vml" xmlns:wp14="http://schemas.microsoft.com/office/word/2010/wordprocessingDrawing" xmlns:wp="http://schemas.openxmlformats.org/drawingml/2006/wordprocessingDrawing" xmlns:w10="urn:schemas-microsoft-com:office:word" xmlns:w="http://schemas.openxmlformats.org/wordprocessingml/2006/main" xmlns:w14="http://schemas.microsoft.com/office/word/2010/wordml" xmlns:w15="http://schemas.microsoft.com/office/word/2012/wordml" xmlns:w16cex="http://schemas.microsoft.com/office/word/2018/wordml/cex" xmlns:w16cid="http://schemas.microsoft.com/office/word/2016/wordml/cid" xmlns:w16="http://schemas.microsoft.com/office/word/2018/wordml" xmlns:w16sdtdh="http://schemas.microsoft.com/office/word/2020/wordml/sdtdatahash" xmlns:w16se="http://schemas.microsoft.com/office/word/2015/wordml/symex" xmlns:wpg="http://schemas.microsoft.com/office/word/2010/wordprocessingGroup" xmlns:wpi="http://schemas.microsoft.com/office/word/2010/wordprocessingInk" xmlns:wne="http://schemas.microsoft.com/office/word/2006/wordml" xmlns:wps="http://schemas.microsoft.com/office/word/2010/wordprocessingShape" mc:Ignorable="w14 w15 w16se w16cid w16 w16cex w16sdtdh wp14">
   <w:p>
     <w:pPr>
       <w:pStyle w:val="Header"/>
@@ -11355,7 +11318,7 @@
 </file>
 
 <file path=word/numbering.xml><?xml version="1.0" encoding="utf-8"?>
-<w:numbering xmlns:wpc="http://schemas.microsoft.com/office/word/2010/wordprocessingCanvas" xmlns:cx="http://schemas.microsoft.com/office/drawing/2014/chartex" xmlns:cx1="http://schemas.microsoft.com/office/drawing/2015/9/8/chartex" xmlns:cx2="http://schemas.microsoft.com/office/drawing/2015/10/21/chartex" xmlns:cx3="http://schemas.microsoft.com/office/drawing/2016/5/9/chartex" xmlns:cx4="http://schemas.microsoft.com/office/drawing/2016/5/10/chartex" xmlns:cx5="http://schemas.microsoft.com/office/drawing/2016/5/11/chartex" xmlns:cx6="http://schemas.microsoft.com/office/drawing/2016/5/12/chartex" xmlns:cx7="http://schemas.microsoft.com/office/drawing/2016/5/13/chartex" xmlns:cx8="http://schemas.microsoft.com/office/drawing/2016/5/14/chartex" xmlns:mc="http://schemas.openxmlformats.org/markup-compatibility/2006" xmlns:aink="http://schemas.microsoft.com/office/drawing/2016/ink" xmlns:am3d="http://schemas.microsoft.com/office/drawing/2017/model3d" xmlns:o="urn:schemas-microsoft-com:office:office" xmlns:oel="http://schemas.microsoft.com/office/2019/extlst" xmlns:r="http://schemas.openxmlformats.org/officeDocument/2006/relationships" xmlns:m="http://schemas.openxmlformats.org/officeDocument/2006/math" xmlns:v="urn:schemas-microsoft-com:vml" xmlns:wp14="http://schemas.microsoft.com/office/word/2010/wordprocessingDrawing" xmlns:wp="http://schemas.openxmlformats.org/drawingml/2006/wordprocessingDrawing" xmlns:w10="urn:schemas-microsoft-com:office:word" xmlns:w="http://schemas.openxmlformats.org/wordprocessingml/2006/main" xmlns:w14="http://schemas.microsoft.com/office/word/2010/wordml" xmlns:w15="http://schemas.microsoft.com/office/word/2012/wordml" xmlns:w16cex="http://schemas.microsoft.com/office/word/2018/wordml/cex" xmlns:w16cid="http://schemas.microsoft.com/office/word/2016/wordml/cid" xmlns:w16="http://schemas.microsoft.com/office/word/2018/wordml" xmlns:w16du="http://schemas.microsoft.com/office/word/2023/wordml/word16du" xmlns:w16sdtdh="http://schemas.microsoft.com/office/word/2020/wordml/sdtdatahash" xmlns:w16sdtfl="http://schemas.microsoft.com/office/word/2024/wordml/sdtformatlock" xmlns:w16se="http://schemas.microsoft.com/office/word/2015/wordml/symex" xmlns:wpg="http://schemas.microsoft.com/office/word/2010/wordprocessingGroup" xmlns:wpi="http://schemas.microsoft.com/office/word/2010/wordprocessingInk" xmlns:wne="http://schemas.microsoft.com/office/word/2006/wordml" xmlns:wps="http://schemas.microsoft.com/office/word/2010/wordprocessingShape" mc:Ignorable="w14 w15 w16se w16cid w16 w16cex w16sdtdh w16sdtfl w16du wp14">
+<w:numbering xmlns:wpc="http://schemas.microsoft.com/office/word/2010/wordprocessingCanvas" xmlns:cx="http://schemas.microsoft.com/office/drawing/2014/chartex" xmlns:cx1="http://schemas.microsoft.com/office/drawing/2015/9/8/chartex" xmlns:cx2="http://schemas.microsoft.com/office/drawing/2015/10/21/chartex" xmlns:cx3="http://schemas.microsoft.com/office/drawing/2016/5/9/chartex" xmlns:cx4="http://schemas.microsoft.com/office/drawing/2016/5/10/chartex" xmlns:cx5="http://schemas.microsoft.com/office/drawing/2016/5/11/chartex" xmlns:cx6="http://schemas.microsoft.com/office/drawing/2016/5/12/chartex" xmlns:cx7="http://schemas.microsoft.com/office/drawing/2016/5/13/chartex" xmlns:cx8="http://schemas.microsoft.com/office/drawing/2016/5/14/chartex" xmlns:mc="http://schemas.openxmlformats.org/markup-compatibility/2006" xmlns:aink="http://schemas.microsoft.com/office/drawing/2016/ink" xmlns:am3d="http://schemas.microsoft.com/office/drawing/2017/model3d" xmlns:o="urn:schemas-microsoft-com:office:office" xmlns:oel="http://schemas.microsoft.com/office/2019/extlst" xmlns:r="http://schemas.openxmlformats.org/officeDocument/2006/relationships" xmlns:m="http://schemas.openxmlformats.org/officeDocument/2006/math" xmlns:v="urn:schemas-microsoft-com:vml" xmlns:wp14="http://schemas.microsoft.com/office/word/2010/wordprocessingDrawing" xmlns:wp="http://schemas.openxmlformats.org/drawingml/2006/wordprocessingDrawing" xmlns:w10="urn:schemas-microsoft-com:office:word" xmlns:w="http://schemas.openxmlformats.org/wordprocessingml/2006/main" xmlns:w14="http://schemas.microsoft.com/office/word/2010/wordml" xmlns:w15="http://schemas.microsoft.com/office/word/2012/wordml" xmlns:w16cex="http://schemas.microsoft.com/office/word/2018/wordml/cex" xmlns:w16cid="http://schemas.microsoft.com/office/word/2016/wordml/cid" xmlns:w16="http://schemas.microsoft.com/office/word/2018/wordml" xmlns:w16sdtdh="http://schemas.microsoft.com/office/word/2020/wordml/sdtdatahash" xmlns:w16se="http://schemas.microsoft.com/office/word/2015/wordml/symex" xmlns:wpg="http://schemas.microsoft.com/office/word/2010/wordprocessingGroup" xmlns:wpi="http://schemas.microsoft.com/office/word/2010/wordprocessingInk" xmlns:wne="http://schemas.microsoft.com/office/word/2006/wordml" xmlns:wps="http://schemas.microsoft.com/office/word/2010/wordprocessingShape" mc:Ignorable="w14 w15 w16se w16cid w16 w16cex w16sdtdh wp14">
   <w:abstractNum w:abstractNumId="0" w15:restartNumberingAfterBreak="0">
     <w:nsid w:val="04E60920"/>
     <w:multiLevelType w:val="hybridMultilevel"/>
@@ -15985,7 +15948,7 @@
 </file>
 
 <file path=word/styles.xml><?xml version="1.0" encoding="utf-8"?>
-<w:styles xmlns:mc="http://schemas.openxmlformats.org/markup-compatibility/2006" xmlns:r="http://schemas.openxmlformats.org/officeDocument/2006/relationships" xmlns:w="http://schemas.openxmlformats.org/wordprocessingml/2006/main" xmlns:w14="http://schemas.microsoft.com/office/word/2010/wordml" xmlns:w15="http://schemas.microsoft.com/office/word/2012/wordml" xmlns:w16cex="http://schemas.microsoft.com/office/word/2018/wordml/cex" xmlns:w16cid="http://schemas.microsoft.com/office/word/2016/wordml/cid" xmlns:w16="http://schemas.microsoft.com/office/word/2018/wordml" xmlns:w16du="http://schemas.microsoft.com/office/word/2023/wordml/word16du" xmlns:w16sdtdh="http://schemas.microsoft.com/office/word/2020/wordml/sdtdatahash" xmlns:w16sdtfl="http://schemas.microsoft.com/office/word/2024/wordml/sdtformatlock" xmlns:w16se="http://schemas.microsoft.com/office/word/2015/wordml/symex" mc:Ignorable="w14 w15 w16se w16cid w16 w16cex w16sdtdh w16sdtfl w16du">
+<w:styles xmlns:mc="http://schemas.openxmlformats.org/markup-compatibility/2006" xmlns:r="http://schemas.openxmlformats.org/officeDocument/2006/relationships" xmlns:w="http://schemas.openxmlformats.org/wordprocessingml/2006/main" xmlns:w14="http://schemas.microsoft.com/office/word/2010/wordml" xmlns:w15="http://schemas.microsoft.com/office/word/2012/wordml" xmlns:w16cex="http://schemas.microsoft.com/office/word/2018/wordml/cex" xmlns:w16cid="http://schemas.microsoft.com/office/word/2016/wordml/cid" xmlns:w16="http://schemas.microsoft.com/office/word/2018/wordml" xmlns:w16sdtdh="http://schemas.microsoft.com/office/word/2020/wordml/sdtdatahash" xmlns:w16se="http://schemas.microsoft.com/office/word/2015/wordml/symex" mc:Ignorable="w14 w15 w16se w16cid w16 w16cex w16sdtdh">
   <w:docDefaults>
     <w:rPrDefault>
       <w:rPr>

</xml_diff>